<commit_message>
Update W/Y Device documentation
</commit_message>
<xml_diff>
--- a/res/WY_Devices.docx
+++ b/res/WY_Devices.docx
@@ -216,7 +216,11 @@
         </w:rPr>
       </w:pPr>
       <w:r>
-        <w:rPr/>
+        <w:rPr>
+          <w:rFonts w:eastAsia="Times New Roman" w:cs="Arial" w:ascii="Arial" w:hAnsi="Arial"/>
+          <w:kern w:val="0"/>
+          <w14:ligatures w14:val="none"/>
+        </w:rPr>
       </w:r>
     </w:p>
     <w:p>
@@ -1146,6 +1150,7 @@
         <w:rPr>
           <w:rFonts w:eastAsia="Times New Roman" w:cs="Arial" w:ascii="Arial" w:hAnsi="Arial"/>
           <w:kern w:val="0"/>
+          <w:sz w:val="21"/>
           <w14:ligatures w14:val="none"/>
         </w:rPr>
       </w:r>
@@ -1474,6 +1479,7 @@
         <w:rPr>
           <w:rFonts w:eastAsia="Times New Roman" w:cs="Arial" w:ascii="Arial" w:hAnsi="Arial"/>
           <w:kern w:val="0"/>
+          <w:sz w:val="21"/>
           <w14:ligatures w14:val="none"/>
         </w:rPr>
       </w:r>
@@ -1980,6 +1986,7 @@
         <w:rPr>
           <w:rFonts w:eastAsia="Times New Roman" w:cs="Arial" w:ascii="Arial" w:hAnsi="Arial"/>
           <w:kern w:val="0"/>
+          <w:sz w:val="21"/>
           <w14:ligatures w14:val="none"/>
         </w:rPr>
       </w:r>
@@ -6466,8 +6473,8 @@
       <w:szCs w:val="28"/>
     </w:rPr>
   </w:style>
-  <w:style w:type="character" w:styleId="Bulletsuser">
-    <w:name w:val="Bullets (user)"/>
+  <w:style w:type="character" w:styleId="Bullets">
+    <w:name w:val="Bullets"/>
     <w:qFormat/>
     <w:rPr>
       <w:rFonts w:ascii="OpenSymbol" w:hAnsi="OpenSymbol" w:eastAsia="OpenSymbol" w:cs="OpenSymbol"/>
@@ -6485,8 +6492,8 @@
     <w:qFormat/>
     <w:rPr/>
   </w:style>
-  <w:style w:type="character" w:styleId="Bullets">
-    <w:name w:val="Bullets"/>
+  <w:style w:type="character" w:styleId="Bulletsuser">
+    <w:name w:val="Bullets (user)"/>
     <w:qFormat/>
     <w:rPr>
       <w:rFonts w:ascii="OpenSymbol" w:hAnsi="OpenSymbol" w:eastAsia="OpenSymbol" w:cs="OpenSymbol"/>

</xml_diff>